<commit_message>
fix preview in progress menu reviewer and archive bug
</commit_message>
<xml_diff>
--- a/SistemBeritaAcara.Web/wwwroot/files/documents/ba-14-draft.docx
+++ b/SistemBeritaAcara.Web/wwwroot/files/documents/ba-14-draft.docx
@@ -304,7 +304,7 @@
                       <w:sz w:val="18"/>
                       <w:szCs w:val="18"/>
                     </w:rPr>
-                    <w:t>Draft</w:t>
+                    <w:t>BA 009/PPNEG1000/2026-S0</w:t>
                   </w:r>
                 </w:p>
               </w:tc>
@@ -2883,14 +2883,46 @@
           </w:tcPr>
           <w:p>
             <w:pPr>
-              <w:pStyle w:val="ListParagraph"/>
               <w:ind w:left="0"/>
-            </w:pPr>
-            <w:r>
-              <w:rPr>
-                <w:color w:val="FFFFFF"/>
-              </w:rPr>
-              <w:t>{{SIG_PJ}}</w:t>
+              <w:jc w:val="left"/>
+              <w:spacing w:after="480"/>
+            </w:pPr>
+            <w:r>
+              <w:drawing>
+                <wp:inline distT="0" distB="0" distL="0" distR="0">
+                  <wp:extent cx="1778000" cy="592666"/>
+                  <wp:effectExtent l="0" t="0" r="0" b="0"/>
+                  <wp:docPr id="7424" name="signature"/>
+                  <wp:cNvGraphicFramePr>
+                    <a:graphicFrameLocks noChangeAspect="1"/>
+                  </wp:cNvGraphicFramePr>
+                  <a:graphic>
+                    <a:graphicData uri="http://schemas.openxmlformats.org/drawingml/2006/picture">
+                      <pic:pic>
+                        <pic:nvPicPr>
+                          <pic:cNvPr id="7425" name="sig.png"/>
+                          <pic:cNvPicPr/>
+                        </pic:nvPicPr>
+                        <pic:blipFill>
+                          <a:blip r:embed="Rd94d1da6a3584d94"/>
+                          <a:stretch>
+                            <a:fillRect/>
+                          </a:stretch>
+                        </pic:blipFill>
+                        <pic:spPr>
+                          <a:xfrm>
+                            <a:off x="0" y="0"/>
+                            <a:ext cx="1778000" cy="592666"/>
+                          </a:xfrm>
+                          <a:prstGeom prst="rect">
+                            <a:avLst/>
+                          </a:prstGeom>
+                        </pic:spPr>
+                      </pic:pic>
+                    </a:graphicData>
+                  </a:graphic>
+                </wp:inline>
+              </w:drawing>
             </w:r>
           </w:p>
           <w:p>

</xml_diff>